<commit_message>
Añadimos el documento alcance, casos de usos y la nueva documentacion de diseño
</commit_message>
<xml_diff>
--- a/Documentación/2. Modelo de Anàlisis/Documento de Análisis.docx
+++ b/Documentación/2. Modelo de Anàlisis/Documento de Análisis.docx
@@ -5,33 +5,197 @@
     <w:p>
       <w:pPr>
         <w:pStyle w:val="Title"/>
+        <w:rPr>
+          <w:rFonts w:ascii="Proxima Nova" w:cs="Proxima Nova" w:eastAsia="Proxima Nova" w:hAnsi="Proxima Nova"/>
+          <w:b w:val="1"/>
+          <w:bCs w:val="1"/>
+          <w:color w:val="039be5"/>
+        </w:rPr>
+      </w:pPr>
+      <w:r>
+        <w:rPr>
+          <w:rFonts w:ascii="Proxima Nova" w:cs="Proxima Nova" w:eastAsia="Proxima Nova" w:hAnsi="Proxima Nova"/>
+          <w:b w:val="1"/>
+          <w:bCs w:val="1"/>
+          <w:color w:val="039be5"/>
+          <w:rtl w:val="0"/>
+        </w:rPr>
+        <w:t xml:space="preserve">FastOrder S.A by Brenda Isabella y Guillermo Marcote</w:t>
+      </w:r>
+      <w:r>
+        <w:rPr>
+          <w:rFonts w:ascii="Proxima Nova" w:cs="Proxima Nova" w:eastAsia="Proxima Nova" w:hAnsi="Proxima Nova"/>
+          <w:color w:val="039be5"/>
+          <w:rtl w:val="0"/>
+        </w:rPr>
+        <w:br w:type="textWrapping"/>
+      </w:r>
+      <w:r>
+        <w:rPr>
+          <w:rFonts w:ascii="Proxima Nova" w:cs="Proxima Nova" w:eastAsia="Proxima Nova" w:hAnsi="Proxima Nova"/>
+          <w:b w:val="1"/>
+          <w:bCs w:val="1"/>
+          <w:color w:val="039be5"/>
+          <w:rtl w:val="0"/>
+        </w:rPr>
+        <w:t xml:space="preserve">ANÁLISIS del proyecto</w:t>
+      </w:r>
+    </w:p>
+    <w:p>
+      <w:pPr>
+        <w:pStyle w:val="Subtitle"/>
+        <w:rPr>
+          <w:rFonts w:ascii="Proxima Nova" w:cs="Proxima Nova" w:eastAsia="Proxima Nova" w:hAnsi="Proxima Nova"/>
+        </w:rPr>
+      </w:pPr>
+      <w:r>
+        <w:rPr>
+          <w:rFonts w:ascii="Proxima Nova" w:cs="Proxima Nova" w:eastAsia="Proxima Nova" w:hAnsi="Proxima Nova"/>
+          <w:rtl w:val="0"/>
+        </w:rPr>
+        <w:t xml:space="preserve">18/09/2025</w:t>
+      </w:r>
+    </w:p>
+    <w:p>
+      <w:pPr>
+        <w:rPr>
+          <w:rFonts w:ascii="Proxima Nova" w:cs="Proxima Nova" w:eastAsia="Proxima Nova" w:hAnsi="Proxima Nova"/>
+        </w:rPr>
+      </w:pPr>
+      <w:r>
+        <w:rPr>
+          <w:rtl w:val="0"/>
+        </w:rPr>
+      </w:r>
+    </w:p>
+    <w:p>
+      <w:pPr>
+        <w:pStyle w:val="Heading1"/>
+        <w:rPr>
+          <w:rFonts w:ascii="Proxima Nova" w:cs="Proxima Nova" w:eastAsia="Proxima Nova" w:hAnsi="Proxima Nova"/>
+          <w:color w:val="039be5"/>
+        </w:rPr>
+      </w:pPr>
+      <w:r>
+        <w:rPr>
+          <w:rFonts w:ascii="Proxima Nova" w:cs="Proxima Nova" w:eastAsia="Proxima Nova" w:hAnsi="Proxima Nova"/>
+          <w:color w:val="039be5"/>
+          <w:rtl w:val="0"/>
+        </w:rPr>
+        <w:t xml:space="preserve">Problemas en términos conceptuales</w:t>
+      </w:r>
+    </w:p>
+    <w:p>
+      <w:pPr>
+        <w:rPr>
+          <w:rFonts w:ascii="Proxima Nova" w:cs="Proxima Nova" w:eastAsia="Proxima Nova" w:hAnsi="Proxima Nova"/>
+        </w:rPr>
+      </w:pPr>
+      <w:r>
+        <w:rPr>
+          <w:rFonts w:ascii="Proxima Nova" w:cs="Proxima Nova" w:eastAsia="Proxima Nova" w:hAnsi="Proxima Nova"/>
+          <w:rtl w:val="0"/>
+        </w:rPr>
+        <w:t xml:space="preserve">Este documento de análisis ha sido solicitado para el relevamiento del problema a solucionar por el aplicativo “</w:t>
+      </w:r>
+      <w:r>
+        <w:rPr>
+          <w:rFonts w:ascii="Proxima Nova" w:cs="Proxima Nova" w:eastAsia="Proxima Nova" w:hAnsi="Proxima Nova"/>
+          <w:b w:val="1"/>
+          <w:bCs w:val="1"/>
+          <w:rtl w:val="0"/>
+        </w:rPr>
+        <w:t xml:space="preserve">FastOrder</w:t>
+      </w:r>
+      <w:r>
+        <w:rPr>
+          <w:rFonts w:ascii="Proxima Nova" w:cs="Proxima Nova" w:eastAsia="Proxima Nova" w:hAnsi="Proxima Nova"/>
+          <w:b w:val="1"/>
+          <w:bCs w:val="1"/>
+          <w:rtl w:val="0"/>
+        </w:rPr>
+        <w:t xml:space="preserve">”</w:t>
+      </w:r>
+      <w:r>
+        <w:rPr>
+          <w:rFonts w:ascii="Proxima Nova" w:cs="Proxima Nova" w:eastAsia="Proxima Nova" w:hAnsi="Proxima Nova"/>
+          <w:rtl w:val="0"/>
+        </w:rPr>
+        <w:t xml:space="preserve">. El problema a solucionar es crear un sistema móvil para la gestión de pedidos en restaurantes y ayudar a mejorar la experiencia y el servicio tanto del consumidor como del mozo. En cuanto a términos de tiempo, al confirmar la orden delante del consumidor, automáticamente se envía a la cocina el pedido, siendo así más preciso el pedido y la aplicación te avisa cuando está el pedido listo para entregar al consumidor.</w:t>
+      </w:r>
+    </w:p>
+    <w:p>
+      <w:pPr>
+        <w:jc w:val="center"/>
+        <w:rPr>
+          <w:color w:val="1c4587"/>
+        </w:rPr>
+      </w:pPr>
+      <w:r>
+        <w:rPr>
+          <w:color w:val="1c4587"/>
+          <w:rtl w:val="0"/>
+        </w:rPr>
+        <w:br w:type="textWrapping"/>
+      </w:r>
+    </w:p>
+    <w:p>
+      <w:pPr>
+        <w:jc w:val="center"/>
+        <w:rPr>
+          <w:color w:val="1c4587"/>
+        </w:rPr>
+      </w:pPr>
+      <w:r>
+        <w:rPr>
+          <w:rtl w:val="0"/>
+        </w:rPr>
+      </w:r>
+    </w:p>
+    <w:p>
+      <w:pPr>
+        <w:jc w:val="center"/>
+        <w:rPr>
+          <w:color w:val="1c4587"/>
+        </w:rPr>
+      </w:pPr>
+      <w:r>
+        <w:rPr>
+          <w:rtl w:val="0"/>
+        </w:rPr>
+      </w:r>
+    </w:p>
+    <w:p>
+      <w:pPr>
+        <w:jc w:val="center"/>
+        <w:rPr>
+          <w:color w:val="1c4587"/>
+        </w:rPr>
+      </w:pPr>
+      <w:r>
+        <w:rPr>
+          <w:rtl w:val="0"/>
+        </w:rPr>
+      </w:r>
+    </w:p>
+    <w:p>
+      <w:pPr>
         <w:rPr/>
       </w:pPr>
       <w:r>
         <w:rPr>
-          <w:b w:val="1"/>
-          <w:rtl w:val="0"/>
-        </w:rPr>
-        <w:t xml:space="preserve">FastOrder S.A by Brenda Isabella y Guillermo Marcote</w:t>
-      </w:r>
-      <w:r>
-        <w:rPr>
-          <w:rtl w:val="0"/>
-        </w:rPr>
-        <w:br w:type="textWrapping"/>
-        <w:t xml:space="preserve">ANÁLISIS del proyecto</w:t>
-      </w:r>
-    </w:p>
-    <w:p>
-      <w:pPr>
-        <w:pStyle w:val="Subtitle"/>
+          <w:rtl w:val="0"/>
+        </w:rPr>
+      </w:r>
+    </w:p>
+    <w:p>
+      <w:pPr>
         <w:rPr/>
       </w:pPr>
       <w:r>
         <w:rPr>
           <w:rtl w:val="0"/>
         </w:rPr>
-        <w:t xml:space="preserve">18/09/2025</w:t>
       </w:r>
     </w:p>
     <w:p>
@@ -44,138 +208,29 @@
         </w:rPr>
       </w:r>
     </w:p>
-    <w:p>
-      <w:pPr>
-        <w:pStyle w:val="Heading1"/>
-        <w:rPr/>
-      </w:pPr>
-      <w:r>
-        <w:rPr>
-          <w:rtl w:val="0"/>
-        </w:rPr>
-        <w:t xml:space="preserve">Problemas en términos conceptuales</w:t>
-      </w:r>
-    </w:p>
-    <w:p>
-      <w:pPr>
-        <w:rPr>
-          <w:color w:val="1c4587"/>
-        </w:rPr>
-      </w:pPr>
-      <w:r>
-        <w:rPr>
-          <w:color w:val="1c4587"/>
-          <w:rtl w:val="0"/>
-        </w:rPr>
-        <w:t xml:space="preserve">Este documento de análisis ha sido solicitado para el relevamiento del problema a solucionar por el aplicativo “</w:t>
-      </w:r>
-      <w:r>
-        <w:rPr>
-          <w:b w:val="1"/>
-          <w:color w:val="1c4587"/>
-          <w:rtl w:val="0"/>
-        </w:rPr>
-        <w:t xml:space="preserve">FastOrder”</w:t>
-      </w:r>
-      <w:r>
-        <w:rPr>
-          <w:color w:val="1c4587"/>
-          <w:rtl w:val="0"/>
-        </w:rPr>
-        <w:t xml:space="preserve">. El problema a solucionar es crear un sistema móvil para la gestión de pedidos en restaurantes y ayudar a mejorar la experiencia y el servicio tanto del consumidor como del mozo. En cuanto a términos de tiempo, al confirmar la orden delante del consumidor, automáticamente se envía a la cocina el pedido, siendo así más preciso el pedido y la aplicación te avisa cuando está el pedido listo para entregar al consumidor.</w:t>
-      </w:r>
-    </w:p>
-    <w:p>
-      <w:pPr>
-        <w:keepNext w:val="0"/>
-        <w:keepLines w:val="0"/>
-        <w:pageBreakBefore w:val="0"/>
-        <w:widowControl w:val="1"/>
-        <w:pBdr>
-          <w:top w:space="0" w:sz="0" w:val="nil"/>
-          <w:left w:space="0" w:sz="0" w:val="nil"/>
-          <w:bottom w:space="0" w:sz="0" w:val="nil"/>
-          <w:right w:space="0" w:sz="0" w:val="nil"/>
-          <w:between w:space="0" w:sz="0" w:val="nil"/>
-        </w:pBdr>
-        <w:shd w:fill="auto" w:val="clear"/>
-        <w:spacing w:after="0" w:before="0" w:line="259" w:lineRule="auto"/>
-        <w:ind w:left="1440" w:right="0" w:firstLine="0"/>
-        <w:jc w:val="left"/>
-        <w:rPr>
-          <w:color w:val="ff0000"/>
-        </w:rPr>
-      </w:pPr>
-      <w:r>
-        <w:rPr>
-          <w:rtl w:val="0"/>
-        </w:rPr>
-      </w:r>
-    </w:p>
-    <w:p>
-      <w:pPr>
-        <w:keepNext w:val="0"/>
-        <w:keepLines w:val="0"/>
-        <w:pageBreakBefore w:val="0"/>
-        <w:widowControl w:val="1"/>
-        <w:pBdr>
-          <w:top w:space="0" w:sz="0" w:val="nil"/>
-          <w:left w:space="0" w:sz="0" w:val="nil"/>
-          <w:bottom w:space="0" w:sz="0" w:val="nil"/>
-          <w:right w:space="0" w:sz="0" w:val="nil"/>
-          <w:between w:space="0" w:sz="0" w:val="nil"/>
-        </w:pBdr>
-        <w:shd w:fill="auto" w:val="clear"/>
-        <w:spacing w:after="160" w:before="0" w:line="259" w:lineRule="auto"/>
-        <w:ind w:left="720" w:right="0" w:firstLine="0"/>
-        <w:jc w:val="left"/>
-        <w:rPr>
-          <w:rFonts w:ascii="Calibri" w:cs="Calibri" w:eastAsia="Calibri" w:hAnsi="Calibri"/>
-          <w:b w:val="0"/>
-          <w:i w:val="0"/>
-          <w:smallCaps w:val="0"/>
-          <w:strike w:val="0"/>
-          <w:color w:val="000000"/>
-          <w:sz w:val="22"/>
-          <w:szCs w:val="22"/>
-          <w:u w:val="none"/>
-          <w:shd w:fill="auto" w:val="clear"/>
-          <w:vertAlign w:val="baseline"/>
-        </w:rPr>
-      </w:pPr>
-      <w:r>
-        <w:rPr>
-          <w:rtl w:val="0"/>
-        </w:rPr>
-      </w:r>
-    </w:p>
-    <w:p>
-      <w:pPr>
-        <w:rPr/>
-      </w:pPr>
-      <w:r>
-        <w:rPr>
-          <w:rtl w:val="0"/>
-        </w:rPr>
-      </w:r>
-    </w:p>
-    <w:p>
-      <w:pPr>
-        <w:rPr/>
-      </w:pPr>
-      <w:r>
-        <w:rPr>
-          <w:rtl w:val="0"/>
-        </w:rPr>
-      </w:r>
-    </w:p>
     <w:sectPr>
+      <w:footerReference r:id="rId7" w:type="default"/>
       <w:pgSz w:h="16838" w:w="11906" w:orient="portrait"/>
       <w:pgMar w:bottom="1417" w:top="1417" w:left="1701" w:right="1701" w:header="708" w:footer="708"/>
       <w:pgNumType w:start="1"/>
     </w:sectPr>
   </w:body>
 </w:document>
+</file>
+
+<file path=word/footer1.xml><?xml version="1.0" encoding="utf-8"?>
+<w:ftr xmlns:mc="http://schemas.openxmlformats.org/markup-compatibility/2006" xmlns:o="urn:schemas-microsoft-com:office:office" xmlns:r="http://schemas.openxmlformats.org/officeDocument/2006/relationships" xmlns:m="http://schemas.openxmlformats.org/officeDocument/2006/math" xmlns:v="urn:schemas-microsoft-com:vml" xmlns:wp="http://schemas.openxmlformats.org/drawingml/2006/wordprocessingDrawing" xmlns:w10="urn:schemas-microsoft-com:office:word" xmlns:w="http://schemas.openxmlformats.org/wordprocessingml/2006/main" xmlns:wne="http://schemas.microsoft.com/office/word/2006/wordml" xmlns:sl="http://schemas.openxmlformats.org/schemaLibrary/2006/main" xmlns:a="http://schemas.openxmlformats.org/drawingml/2006/main" xmlns:pic="http://schemas.openxmlformats.org/drawingml/2006/picture" xmlns:c="http://schemas.openxmlformats.org/drawingml/2006/chart" xmlns:lc="http://schemas.openxmlformats.org/drawingml/2006/lockedCanvas" xmlns:dgm="http://schemas.openxmlformats.org/drawingml/2006/diagram" xmlns:wps="http://schemas.microsoft.com/office/word/2010/wordprocessingShape" xmlns:wpg="http://schemas.microsoft.com/office/word/2010/wordprocessingGroup" xmlns:w14="http://schemas.microsoft.com/office/word/2010/wordml" xmlns:w15="http://schemas.microsoft.com/office/word/2012/wordml" xmlns:w16="http://schemas.microsoft.com/office/word/2018/wordml" xmlns:w16cex="http://schemas.microsoft.com/office/word/2018/wordml/cex" xmlns:w16cid="http://schemas.microsoft.com/office/word/2016/wordml/cid" xmlns="http://schemas.microsoft.com/office/tasks/2019/documenttasks" xmlns:cr="http://schemas.microsoft.com/office/comments/2020/reactions">
+  <w:p>
+    <w:pPr>
+      <w:rPr/>
+    </w:pPr>
+    <w:r>
+      <w:rPr>
+        <w:rtl w:val="0"/>
+      </w:rPr>
+    </w:r>
+  </w:p>
+</w:ftr>
 </file>
 
 <file path=word/numbering.xml><?xml version="1.0" encoding="utf-8"?>
@@ -224,6 +279,7 @@
     </w:pPr>
     <w:rPr>
       <w:b w:val="1"/>
+      <w:bCs w:val="1"/>
       <w:smallCaps w:val="1"/>
       <w:color w:val="1f3864"/>
       <w:sz w:val="28"/>
@@ -242,6 +298,7 @@
     </w:pPr>
     <w:rPr>
       <w:b w:val="1"/>
+      <w:bCs w:val="1"/>
       <w:sz w:val="36"/>
       <w:szCs w:val="36"/>
     </w:rPr>
@@ -258,6 +315,7 @@
     </w:pPr>
     <w:rPr>
       <w:b w:val="1"/>
+      <w:bCs w:val="1"/>
       <w:sz w:val="28"/>
       <w:szCs w:val="28"/>
     </w:rPr>
@@ -274,6 +332,7 @@
     </w:pPr>
     <w:rPr>
       <w:b w:val="1"/>
+      <w:bCs w:val="1"/>
       <w:sz w:val="24"/>
       <w:szCs w:val="24"/>
     </w:rPr>
@@ -290,6 +349,7 @@
     </w:pPr>
     <w:rPr>
       <w:b w:val="1"/>
+      <w:bCs w:val="1"/>
       <w:sz w:val="22"/>
       <w:szCs w:val="22"/>
     </w:rPr>
@@ -306,6 +366,7 @@
     </w:pPr>
     <w:rPr>
       <w:b w:val="1"/>
+      <w:bCs w:val="1"/>
       <w:sz w:val="20"/>
       <w:szCs w:val="20"/>
     </w:rPr>
@@ -441,6 +502,7 @@
     </w:pPr>
     <w:rPr>
       <w:b w:val="1"/>
+      <w:bCs w:val="1"/>
       <w:color w:val="4472c4"/>
       <w:sz w:val="24"/>
       <w:szCs w:val="24"/>

</xml_diff>